<commit_message>
Add results for lab2 from own PC
</commit_message>
<xml_diff>
--- a/lab2_cpp/report/Отчёт_ПП_2_Абрамкин_Должиков.docx
+++ b/lab2_cpp/report/Отчёт_ПП_2_Абрамкин_Должиков.docx
@@ -1566,7 +1566,7 @@
               <w:pStyle w:val="aff1"/>
             </w:pPr>
             <w:r>
-              <w:t xml:space="preserve">Intel(R) Xeon(R) Processor</w:t>
+              <w:t xml:space="preserve">Intel(R) Xeon(R) CPU E5-2678 v3 @ 2.50GHz</w:t>
             </w:r>
           </w:p>
         </w:tc>
@@ -1596,7 +1596,7 @@
               <w:pStyle w:val="aff1"/>
             </w:pPr>
             <w:r>
-              <w:t xml:space="preserve">2,70 ГГц</w:t>
+              <w:t xml:space="preserve">2,50 ГГц</w:t>
             </w:r>
           </w:p>
         </w:tc>
@@ -1626,7 +1626,7 @@
               <w:pStyle w:val="aff1"/>
             </w:pPr>
             <w:r>
-              <w:t xml:space="preserve">4</w:t>
+              <w:t xml:space="preserve">12</w:t>
             </w:r>
           </w:p>
         </w:tc>
@@ -1656,7 +1656,7 @@
               <w:pStyle w:val="aff1"/>
             </w:pPr>
             <w:r>
-              <w:t xml:space="preserve">4</w:t>
+              <w:t xml:space="preserve">24</w:t>
             </w:r>
           </w:p>
         </w:tc>
@@ -1672,7 +1672,7 @@
               <w:pStyle w:val="aff1"/>
             </w:pPr>
             <w:r>
-              <w:t xml:space="preserve">Кэш L1 данных</w:t>
+              <w:t xml:space="preserve">Кэш L2</w:t>
             </w:r>
           </w:p>
         </w:tc>
@@ -1686,7 +1686,7 @@
               <w:pStyle w:val="aff1"/>
             </w:pPr>
             <w:r>
-              <w:t xml:space="preserve">192 КБ (4 × 48 КБ)</w:t>
+              <w:t xml:space="preserve">3 МБ (12 × 256 КБ)</w:t>
             </w:r>
           </w:p>
         </w:tc>
@@ -1702,7 +1702,7 @@
               <w:pStyle w:val="aff1"/>
             </w:pPr>
             <w:r>
-              <w:t xml:space="preserve">Кэш L2</w:t>
+              <w:t xml:space="preserve">Кэш L3</w:t>
             </w:r>
           </w:p>
         </w:tc>
@@ -1716,7 +1716,7 @@
               <w:pStyle w:val="aff1"/>
             </w:pPr>
             <w:r>
-              <w:t xml:space="preserve">8 МБ (4 × 2 МБ)</w:t>
+              <w:t xml:space="preserve">30 МБ</w:t>
             </w:r>
           </w:p>
         </w:tc>
@@ -1732,7 +1732,7 @@
               <w:pStyle w:val="aff1"/>
             </w:pPr>
             <w:r>
-              <w:t xml:space="preserve">Кэш L3</w:t>
+              <w:t xml:space="preserve">Операционная система</w:t>
             </w:r>
           </w:p>
         </w:tc>
@@ -1746,7 +1746,7 @@
               <w:pStyle w:val="aff1"/>
             </w:pPr>
             <w:r>
-              <w:t xml:space="preserve">480 МБ</w:t>
+              <w:t xml:space="preserve">Windows-11-10.0.26200-SP0</w:t>
             </w:r>
           </w:p>
         </w:tc>
@@ -1762,7 +1762,7 @@
               <w:pStyle w:val="aff1"/>
             </w:pPr>
             <w:r>
-              <w:t xml:space="preserve">Операционная система</w:t>
+              <w:t xml:space="preserve">Компилятор</w:t>
             </w:r>
           </w:p>
         </w:tc>
@@ -1776,37 +1776,7 @@
               <w:pStyle w:val="aff1"/>
             </w:pPr>
             <w:r>
-              <w:t xml:space="preserve">Linux-6.18.44-fc-v185-x86_64-with-glibc2.39</w:t>
-            </w:r>
-          </w:p>
-        </w:tc>
-      </w:tr>
-      <w:tr>
-        <w:tc>
-          <w:tcPr>
-            <w:tcW w:w="4819" w:type="dxa"/>
-            <w:vAlign w:val="center"/>
-          </w:tcPr>
-          <w:p>
-            <w:pPr>
-              <w:pStyle w:val="aff1"/>
-            </w:pPr>
-            <w:r>
-              <w:t xml:space="preserve">Компилятор</w:t>
-            </w:r>
-          </w:p>
-        </w:tc>
-        <w:tc>
-          <w:tcPr>
-            <w:tcW w:w="4819" w:type="dxa"/>
-            <w:vAlign w:val="center"/>
-          </w:tcPr>
-          <w:p>
-            <w:pPr>
-              <w:pStyle w:val="aff1"/>
-            </w:pPr>
-            <w:r>
-              <w:t xml:space="preserve">GCC 13.3.0</w:t>
+              <w:t xml:space="preserve">MSVC 195136260</w:t>
             </w:r>
           </w:p>
         </w:tc>
@@ -3791,7 +3761,7 @@
         <w:pStyle w:val="1-"/>
       </w:pPr>
       <w:r>
-        <w:t xml:space="preserve">Одни и те же исходные тексты собираются в четыре программы, отличающиеся только ключами компиляции (таблица 1). Компилятор — GCC 13.3.0.</w:t>
+        <w:t xml:space="preserve">Одни и те же исходные тексты собираются в четыре программы, отличающиеся только ключами компиляции (таблица 1). Компилятор — MSVC 195136260.</w:t>
       </w:r>
     </w:p>
     <w:p>
@@ -3903,7 +3873,7 @@
               <w:pStyle w:val="aff1"/>
             </w:pPr>
             <w:r>
-              <w:t xml:space="preserve">-O0</w:t>
+              <w:t xml:space="preserve">/Od</w:t>
             </w:r>
           </w:p>
         </w:tc>
@@ -3947,7 +3917,7 @@
               <w:pStyle w:val="aff1"/>
             </w:pPr>
             <w:r>
-              <w:t xml:space="preserve">-O3 -march=native</w:t>
+              <w:t xml:space="preserve">/O2 /arch:AVX2</w:t>
             </w:r>
           </w:p>
         </w:tc>
@@ -3991,7 +3961,7 @@
               <w:pStyle w:val="aff1"/>
             </w:pPr>
             <w:r>
-              <w:t xml:space="preserve">-O3 -march=native -fno-tree-vectorize</w:t>
+              <w:t xml:space="preserve">/O2</w:t>
             </w:r>
           </w:p>
         </w:tc>
@@ -4035,7 +4005,7 @@
               <w:pStyle w:val="aff1"/>
             </w:pPr>
             <w:r>
-              <w:t xml:space="preserve">-O3 -march=native -ffast-math</w:t>
+              <w:t xml:space="preserve">/O2 /arch:AVX2 /fp:fast</w:t>
             </w:r>
           </w:p>
         </w:tc>
@@ -4693,7 +4663,7 @@
               <w:jc w:val="center"/>
             </w:pPr>
             <w:r>
-              <w:t xml:space="preserve">4,44·10⁻¹⁶</w:t>
+              <w:t xml:space="preserve">7,77·10⁻¹⁶</w:t>
             </w:r>
           </w:p>
         </w:tc>
@@ -4770,7 +4740,7 @@
               <w:jc w:val="center"/>
             </w:pPr>
             <w:r>
-              <w:t xml:space="preserve">6,11·10⁻¹⁶</w:t>
+              <w:t xml:space="preserve">7,77·10⁻¹⁶</w:t>
             </w:r>
           </w:p>
         </w:tc>
@@ -4847,7 +4817,7 @@
               <w:jc w:val="center"/>
             </w:pPr>
             <w:r>
-              <w:t xml:space="preserve">6,11·10⁻¹⁶</w:t>
+              <w:t xml:space="preserve">7,77·10⁻¹⁶</w:t>
             </w:r>
           </w:p>
         </w:tc>
@@ -4924,7 +4894,7 @@
               <w:jc w:val="center"/>
             </w:pPr>
             <w:r>
-              <w:t xml:space="preserve">2,11·10⁻¹⁵</w:t>
+              <w:t xml:space="preserve">1,44·10⁻¹⁵</w:t>
             </w:r>
           </w:p>
         </w:tc>
@@ -5001,7 +4971,7 @@
               <w:jc w:val="center"/>
             </w:pPr>
             <w:r>
-              <w:t xml:space="preserve">2,28·10⁻¹⁵</w:t>
+              <w:t xml:space="preserve">2,61·10⁻¹⁵</w:t>
             </w:r>
           </w:p>
         </w:tc>
@@ -5078,7 +5048,7 @@
               <w:jc w:val="center"/>
             </w:pPr>
             <w:r>
-              <w:t xml:space="preserve">2,78·10⁻¹⁵</w:t>
+              <w:t xml:space="preserve">3,33·10⁻¹⁵</w:t>
             </w:r>
           </w:p>
         </w:tc>
@@ -5155,7 +5125,7 @@
               <w:jc w:val="center"/>
             </w:pPr>
             <w:r>
-              <w:t xml:space="preserve">3,77·10⁻¹⁵</w:t>
+              <w:t xml:space="preserve">3,33·10⁻¹⁵</w:t>
             </w:r>
           </w:p>
         </w:tc>
@@ -5232,7 +5202,7 @@
               <w:jc w:val="center"/>
             </w:pPr>
             <w:r>
-              <w:t xml:space="preserve">5,33·10⁻¹⁵</w:t>
+              <w:t xml:space="preserve">5,00·10⁻¹⁵</w:t>
             </w:r>
           </w:p>
         </w:tc>
@@ -5309,7 +5279,7 @@
               <w:jc w:val="center"/>
             </w:pPr>
             <w:r>
-              <w:t xml:space="preserve">8,99·10⁻¹⁵</w:t>
+              <w:t xml:space="preserve">7,49·10⁻¹⁵</w:t>
             </w:r>
           </w:p>
         </w:tc>
@@ -5386,7 +5356,7 @@
               <w:jc w:val="center"/>
             </w:pPr>
             <w:r>
-              <w:t xml:space="preserve">1,25·10⁻¹⁴</w:t>
+              <w:t xml:space="preserve">2,64·10⁻¹⁴</w:t>
             </w:r>
           </w:p>
         </w:tc>
@@ -5463,7 +5433,7 @@
               <w:jc w:val="center"/>
             </w:pPr>
             <w:r>
-              <w:t xml:space="preserve">3,01·10⁻¹⁴</w:t>
+              <w:t xml:space="preserve">2,64·10⁻¹⁴</w:t>
             </w:r>
           </w:p>
         </w:tc>
@@ -5743,7 +5713,7 @@
               <w:jc w:val="center"/>
             </w:pPr>
             <w:r>
-              <w:t xml:space="preserve">0,0971</w:t>
+              <w:t xml:space="preserve">0,175</w:t>
             </w:r>
           </w:p>
         </w:tc>
@@ -5758,7 +5728,7 @@
               <w:jc w:val="center"/>
             </w:pPr>
             <w:r>
-              <w:t xml:space="preserve">0,0224</w:t>
+              <w:t xml:space="preserve">0,0410</w:t>
             </w:r>
           </w:p>
         </w:tc>
@@ -5773,22 +5743,22 @@
               <w:jc w:val="center"/>
             </w:pPr>
             <w:r>
+              <w:t xml:space="preserve">4,26</w:t>
+            </w:r>
+          </w:p>
+        </w:tc>
+        <w:tc>
+          <w:tcPr>
+            <w:tcW w:w="2019" w:type="dxa"/>
+            <w:vAlign w:val="center"/>
+          </w:tcPr>
+          <w:p>
+            <w:pPr>
+              <w:pStyle w:val="aff1"/>
+              <w:jc w:val="center"/>
+            </w:pPr>
+            <w:r>
               <w:t xml:space="preserve">4,33</w:t>
-            </w:r>
-          </w:p>
-        </w:tc>
-        <w:tc>
-          <w:tcPr>
-            <w:tcW w:w="2019" w:type="dxa"/>
-            <w:vAlign w:val="center"/>
-          </w:tcPr>
-          <w:p>
-            <w:pPr>
-              <w:pStyle w:val="aff1"/>
-              <w:jc w:val="center"/>
-            </w:pPr>
-            <w:r>
-              <w:t xml:space="preserve">7,07</w:t>
             </w:r>
           </w:p>
         </w:tc>
@@ -5820,7 +5790,7 @@
               <w:jc w:val="center"/>
             </w:pPr>
             <w:r>
-              <w:t xml:space="preserve">0,315</w:t>
+              <w:t xml:space="preserve">0,558</w:t>
             </w:r>
           </w:p>
         </w:tc>
@@ -5835,7 +5805,7 @@
               <w:jc w:val="center"/>
             </w:pPr>
             <w:r>
-              <w:t xml:space="preserve">0,0638</w:t>
+              <w:t xml:space="preserve">0,132</w:t>
             </w:r>
           </w:p>
         </w:tc>
@@ -5850,7 +5820,7 @@
               <w:jc w:val="center"/>
             </w:pPr>
             <w:r>
-              <w:t xml:space="preserve">4,94</w:t>
+              <w:t xml:space="preserve">4,22</w:t>
             </w:r>
           </w:p>
         </w:tc>
@@ -5865,7 +5835,7 @@
               <w:jc w:val="center"/>
             </w:pPr>
             <w:r>
-              <w:t xml:space="preserve">6,54</w:t>
+              <w:t xml:space="preserve">4,02</w:t>
             </w:r>
           </w:p>
         </w:tc>
@@ -5897,7 +5867,7 @@
               <w:jc w:val="center"/>
             </w:pPr>
             <w:r>
-              <w:t xml:space="preserve">0,740</w:t>
+              <w:t xml:space="preserve">1,29</w:t>
             </w:r>
           </w:p>
         </w:tc>
@@ -5912,7 +5882,7 @@
               <w:jc w:val="center"/>
             </w:pPr>
             <w:r>
-              <w:t xml:space="preserve">0,136</w:t>
+              <w:t xml:space="preserve">0,307</w:t>
             </w:r>
           </w:p>
         </w:tc>
@@ -5927,7 +5897,7 @@
               <w:jc w:val="center"/>
             </w:pPr>
             <w:r>
-              <w:t xml:space="preserve">5,46</w:t>
+              <w:t xml:space="preserve">4,22</w:t>
             </w:r>
           </w:p>
         </w:tc>
@@ -5942,7 +5912,7 @@
               <w:jc w:val="center"/>
             </w:pPr>
             <w:r>
-              <w:t xml:space="preserve">6,47</w:t>
+              <w:t xml:space="preserve">3,81</w:t>
             </w:r>
           </w:p>
         </w:tc>
@@ -5974,7 +5944,7 @@
               <w:jc w:val="center"/>
             </w:pPr>
             <w:r>
-              <w:t xml:space="preserve">2,43</w:t>
+              <w:t xml:space="preserve">4,21</w:t>
             </w:r>
           </w:p>
         </w:tc>
@@ -5989,7 +5959,7 @@
               <w:jc w:val="center"/>
             </w:pPr>
             <w:r>
-              <w:t xml:space="preserve">0,411</w:t>
+              <w:t xml:space="preserve">1,01</w:t>
             </w:r>
           </w:p>
         </w:tc>
@@ -6004,7 +5974,7 @@
               <w:jc w:val="center"/>
             </w:pPr>
             <w:r>
-              <w:t xml:space="preserve">5,92</w:t>
+              <w:t xml:space="preserve">4,16</w:t>
             </w:r>
           </w:p>
         </w:tc>
@@ -6019,7 +5989,7 @@
               <w:jc w:val="center"/>
             </w:pPr>
             <w:r>
-              <w:t xml:space="preserve">6,08</w:t>
+              <w:t xml:space="preserve">3,59</w:t>
             </w:r>
           </w:p>
         </w:tc>
@@ -6051,7 +6021,7 @@
               <w:jc w:val="center"/>
             </w:pPr>
             <w:r>
-              <w:t xml:space="preserve">5,79</w:t>
+              <w:t xml:space="preserve">10,0</w:t>
             </w:r>
           </w:p>
         </w:tc>
@@ -6066,7 +6036,7 @@
               <w:jc w:val="center"/>
             </w:pPr>
             <w:r>
-              <w:t xml:space="preserve">0,929</w:t>
+              <w:t xml:space="preserve">2,47</w:t>
             </w:r>
           </w:p>
         </w:tc>
@@ -6081,7 +6051,7 @@
               <w:jc w:val="center"/>
             </w:pPr>
             <w:r>
-              <w:t xml:space="preserve">6,23</w:t>
+              <w:t xml:space="preserve">4,06</w:t>
             </w:r>
           </w:p>
         </w:tc>
@@ -6096,7 +6066,7 @@
               <w:jc w:val="center"/>
             </w:pPr>
             <w:r>
-              <w:t xml:space="preserve">5,75</w:t>
+              <w:t xml:space="preserve">3,27</w:t>
             </w:r>
           </w:p>
         </w:tc>
@@ -6128,7 +6098,7 @@
               <w:jc w:val="center"/>
             </w:pPr>
             <w:r>
-              <w:t xml:space="preserve">19,3</w:t>
+              <w:t xml:space="preserve">33,2</w:t>
             </w:r>
           </w:p>
         </w:tc>
@@ -6143,7 +6113,7 @@
               <w:jc w:val="center"/>
             </w:pPr>
             <w:r>
-              <w:t xml:space="preserve">2,93</w:t>
+              <w:t xml:space="preserve">8,03</w:t>
             </w:r>
           </w:p>
         </w:tc>
@@ -6158,7 +6128,7 @@
               <w:jc w:val="center"/>
             </w:pPr>
             <w:r>
-              <w:t xml:space="preserve">6,57</w:t>
+              <w:t xml:space="preserve">4,13</w:t>
             </w:r>
           </w:p>
         </w:tc>
@@ -6173,7 +6143,7 @@
               <w:jc w:val="center"/>
             </w:pPr>
             <w:r>
-              <w:t xml:space="preserve">5,45</w:t>
+              <w:t xml:space="preserve">3,15</w:t>
             </w:r>
           </w:p>
         </w:tc>
@@ -6205,7 +6175,7 @@
               <w:jc w:val="center"/>
             </w:pPr>
             <w:r>
-              <w:t xml:space="preserve">46,6</w:t>
+              <w:t xml:space="preserve">78,9</w:t>
             </w:r>
           </w:p>
         </w:tc>
@@ -6220,7 +6190,7 @@
               <w:jc w:val="center"/>
             </w:pPr>
             <w:r>
-              <w:t xml:space="preserve">6,96</w:t>
+              <w:t xml:space="preserve">19,8</w:t>
             </w:r>
           </w:p>
         </w:tc>
@@ -6235,7 +6205,7 @@
               <w:jc w:val="center"/>
             </w:pPr>
             <w:r>
-              <w:t xml:space="preserve">6,69</w:t>
+              <w:t xml:space="preserve">3,98</w:t>
             </w:r>
           </w:p>
         </w:tc>
@@ -6250,7 +6220,7 @@
               <w:jc w:val="center"/>
             </w:pPr>
             <w:r>
-              <w:t xml:space="preserve">5,02</w:t>
+              <w:t xml:space="preserve">3,04</w:t>
             </w:r>
           </w:p>
         </w:tc>
@@ -6282,7 +6252,7 @@
               <w:jc w:val="center"/>
             </w:pPr>
             <w:r>
-              <w:t xml:space="preserve">157</w:t>
+              <w:t xml:space="preserve">264</w:t>
             </w:r>
           </w:p>
         </w:tc>
@@ -6297,7 +6267,7 @@
               <w:jc w:val="center"/>
             </w:pPr>
             <w:r>
-              <w:t xml:space="preserve">23,2</w:t>
+              <w:t xml:space="preserve">66,1</w:t>
             </w:r>
           </w:p>
         </w:tc>
@@ -6312,7 +6282,7 @@
               <w:jc w:val="center"/>
             </w:pPr>
             <w:r>
-              <w:t xml:space="preserve">6,77</w:t>
+              <w:t xml:space="preserve">3,99</w:t>
             </w:r>
           </w:p>
         </w:tc>
@@ -6327,7 +6297,7 @@
               <w:jc w:val="center"/>
             </w:pPr>
             <w:r>
-              <w:t xml:space="preserve">4,68</w:t>
+              <w:t xml:space="preserve">2,91</w:t>
             </w:r>
           </w:p>
         </w:tc>
@@ -6359,7 +6329,7 @@
               <w:jc w:val="center"/>
             </w:pPr>
             <w:r>
-              <w:t xml:space="preserve">372</w:t>
+              <w:t xml:space="preserve">641</w:t>
             </w:r>
           </w:p>
         </w:tc>
@@ -6374,7 +6344,7 @@
               <w:jc w:val="center"/>
             </w:pPr>
             <w:r>
-              <w:t xml:space="preserve">55,4</w:t>
+              <w:t xml:space="preserve">174</w:t>
             </w:r>
           </w:p>
         </w:tc>
@@ -6389,7 +6359,7 @@
               <w:jc w:val="center"/>
             </w:pPr>
             <w:r>
-              <w:t xml:space="preserve">6,71</w:t>
+              <w:t xml:space="preserve">3,68</w:t>
             </w:r>
           </w:p>
         </w:tc>
@@ -6404,7 +6374,7 @@
               <w:jc w:val="center"/>
             </w:pPr>
             <w:r>
-              <w:t xml:space="preserve">3,84</w:t>
+              <w:t xml:space="preserve">2,88</w:t>
             </w:r>
           </w:p>
         </w:tc>
@@ -6436,7 +6406,7 @@
               <w:jc w:val="center"/>
             </w:pPr>
             <w:r>
-              <w:t xml:space="preserve">1295</w:t>
+              <w:t xml:space="preserve">2109</w:t>
             </w:r>
           </w:p>
         </w:tc>
@@ -6451,7 +6421,7 @@
               <w:jc w:val="center"/>
             </w:pPr>
             <w:r>
-              <w:t xml:space="preserve">183</w:t>
+              <w:t xml:space="preserve">542</w:t>
             </w:r>
           </w:p>
         </w:tc>
@@ -6466,7 +6436,7 @@
               <w:jc w:val="center"/>
             </w:pPr>
             <w:r>
-              <w:t xml:space="preserve">7,08</w:t>
+              <w:t xml:space="preserve">3,89</w:t>
             </w:r>
           </w:p>
         </w:tc>
@@ -6481,7 +6451,7 @@
               <w:jc w:val="center"/>
             </w:pPr>
             <w:r>
-              <w:t xml:space="preserve">3,62</w:t>
+              <w:t xml:space="preserve">2,90</w:t>
             </w:r>
           </w:p>
         </w:tc>
@@ -6513,7 +6483,7 @@
               <w:jc w:val="center"/>
             </w:pPr>
             <w:r>
-              <w:t xml:space="preserve">3057</w:t>
+              <w:t xml:space="preserve">5758</w:t>
             </w:r>
           </w:p>
         </w:tc>
@@ -6528,7 +6498,7 @@
               <w:jc w:val="center"/>
             </w:pPr>
             <w:r>
-              <w:t xml:space="preserve">445</w:t>
+              <w:t xml:space="preserve">1779</w:t>
             </w:r>
           </w:p>
         </w:tc>
@@ -6543,7 +6513,7 @@
               <w:jc w:val="center"/>
             </w:pPr>
             <w:r>
-              <w:t xml:space="preserve">6,86</w:t>
+              <w:t xml:space="preserve">3,24</w:t>
             </w:r>
           </w:p>
         </w:tc>
@@ -6558,7 +6528,7 @@
               <w:jc w:val="center"/>
             </w:pPr>
             <w:r>
-              <w:t xml:space="preserve">3,66</w:t>
+              <w:t xml:space="preserve">2,77</w:t>
             </w:r>
           </w:p>
         </w:tc>
@@ -6964,7 +6934,7 @@
               <w:jc w:val="center"/>
             </w:pPr>
             <w:r>
-              <w:t xml:space="preserve">0,0122</w:t>
+              <w:t xml:space="preserve">0,0374</w:t>
             </w:r>
           </w:p>
         </w:tc>
@@ -6979,7 +6949,7 @@
               <w:jc w:val="center"/>
             </w:pPr>
             <w:r>
-              <w:t xml:space="preserve">0,0224</w:t>
+              <w:t xml:space="preserve">0,0410</w:t>
             </w:r>
           </w:p>
         </w:tc>
@@ -6994,7 +6964,7 @@
               <w:jc w:val="center"/>
             </w:pPr>
             <w:r>
-              <w:t xml:space="preserve">0,55</w:t>
+              <w:t xml:space="preserve">0,91</w:t>
             </w:r>
           </w:p>
         </w:tc>
@@ -7009,7 +6979,7 @@
               <w:jc w:val="center"/>
             </w:pPr>
             <w:r>
-              <w:t xml:space="preserve">0,89</w:t>
+              <w:t xml:space="preserve">0,93</w:t>
             </w:r>
           </w:p>
         </w:tc>
@@ -7041,7 +7011,7 @@
               <w:jc w:val="center"/>
             </w:pPr>
             <w:r>
-              <w:t xml:space="preserve">0,0434</w:t>
+              <w:t xml:space="preserve">0,129</w:t>
             </w:r>
           </w:p>
         </w:tc>
@@ -7056,7 +7026,7 @@
               <w:jc w:val="center"/>
             </w:pPr>
             <w:r>
-              <w:t xml:space="preserve">0,0638</w:t>
+              <w:t xml:space="preserve">0,132</w:t>
             </w:r>
           </w:p>
         </w:tc>
@@ -7071,7 +7041,7 @@
               <w:jc w:val="center"/>
             </w:pPr>
             <w:r>
-              <w:t xml:space="preserve">0,68</w:t>
+              <w:t xml:space="preserve">0,97</w:t>
             </w:r>
           </w:p>
         </w:tc>
@@ -7086,7 +7056,7 @@
               <w:jc w:val="center"/>
             </w:pPr>
             <w:r>
-              <w:t xml:space="preserve">0,90</w:t>
+              <w:t xml:space="preserve">0,93</w:t>
             </w:r>
           </w:p>
         </w:tc>
@@ -7118,7 +7088,7 @@
               <w:jc w:val="center"/>
             </w:pPr>
             <w:r>
-              <w:t xml:space="preserve">0,105</w:t>
+              <w:t xml:space="preserve">0,316</w:t>
             </w:r>
           </w:p>
         </w:tc>
@@ -7133,7 +7103,7 @@
               <w:jc w:val="center"/>
             </w:pPr>
             <w:r>
-              <w:t xml:space="preserve">0,136</w:t>
+              <w:t xml:space="preserve">0,307</w:t>
             </w:r>
           </w:p>
         </w:tc>
@@ -7148,7 +7118,7 @@
               <w:jc w:val="center"/>
             </w:pPr>
             <w:r>
-              <w:t xml:space="preserve">0,78</w:t>
+              <w:t xml:space="preserve">1,03</w:t>
             </w:r>
           </w:p>
         </w:tc>
@@ -7163,7 +7133,7 @@
               <w:jc w:val="center"/>
             </w:pPr>
             <w:r>
-              <w:t xml:space="preserve">0,92</w:t>
+              <w:t xml:space="preserve">0,93</w:t>
             </w:r>
           </w:p>
         </w:tc>
@@ -7195,7 +7165,7 @@
               <w:jc w:val="center"/>
             </w:pPr>
             <w:r>
-              <w:t xml:space="preserve">0,391</w:t>
+              <w:t xml:space="preserve">1,12</w:t>
             </w:r>
           </w:p>
         </w:tc>
@@ -7210,7 +7180,7 @@
               <w:jc w:val="center"/>
             </w:pPr>
             <w:r>
-              <w:t xml:space="preserve">0,411</w:t>
+              <w:t xml:space="preserve">1,01</w:t>
             </w:r>
           </w:p>
         </w:tc>
@@ -7225,22 +7195,22 @@
               <w:jc w:val="center"/>
             </w:pPr>
             <w:r>
+              <w:t xml:space="preserve">1,10</w:t>
+            </w:r>
+          </w:p>
+        </w:tc>
+        <w:tc>
+          <w:tcPr>
+            <w:tcW w:w="2019" w:type="dxa"/>
+            <w:vAlign w:val="center"/>
+          </w:tcPr>
+          <w:p>
+            <w:pPr>
+              <w:pStyle w:val="aff1"/>
+              <w:jc w:val="center"/>
+            </w:pPr>
+            <w:r>
               <w:t xml:space="preserve">0,95</w:t>
-            </w:r>
-          </w:p>
-        </w:tc>
-        <w:tc>
-          <w:tcPr>
-            <w:tcW w:w="2019" w:type="dxa"/>
-            <w:vAlign w:val="center"/>
-          </w:tcPr>
-          <w:p>
-            <w:pPr>
-              <w:pStyle w:val="aff1"/>
-              <w:jc w:val="center"/>
-            </w:pPr>
-            <w:r>
-              <w:t xml:space="preserve">0,98</w:t>
             </w:r>
           </w:p>
         </w:tc>
@@ -7272,7 +7242,7 @@
               <w:jc w:val="center"/>
             </w:pPr>
             <w:r>
-              <w:t xml:space="preserve">0,980</w:t>
+              <w:t xml:space="preserve">2,93</w:t>
             </w:r>
           </w:p>
         </w:tc>
@@ -7287,7 +7257,7 @@
               <w:jc w:val="center"/>
             </w:pPr>
             <w:r>
-              <w:t xml:space="preserve">0,929</w:t>
+              <w:t xml:space="preserve">2,47</w:t>
             </w:r>
           </w:p>
         </w:tc>
@@ -7302,7 +7272,7 @@
               <w:jc w:val="center"/>
             </w:pPr>
             <w:r>
-              <w:t xml:space="preserve">1,05</w:t>
+              <w:t xml:space="preserve">1,18</w:t>
             </w:r>
           </w:p>
         </w:tc>
@@ -7317,7 +7287,7 @@
               <w:jc w:val="center"/>
             </w:pPr>
             <w:r>
-              <w:t xml:space="preserve">0,97</w:t>
+              <w:t xml:space="preserve">0,95</w:t>
             </w:r>
           </w:p>
         </w:tc>
@@ -7349,7 +7319,7 @@
               <w:jc w:val="center"/>
             </w:pPr>
             <w:r>
-              <w:t xml:space="preserve">3,53</w:t>
+              <w:t xml:space="preserve">10,1</w:t>
             </w:r>
           </w:p>
         </w:tc>
@@ -7364,7 +7334,7 @@
               <w:jc w:val="center"/>
             </w:pPr>
             <w:r>
-              <w:t xml:space="preserve">2,93</w:t>
+              <w:t xml:space="preserve">8,03</w:t>
             </w:r>
           </w:p>
         </w:tc>
@@ -7379,7 +7349,7 @@
               <w:jc w:val="center"/>
             </w:pPr>
             <w:r>
-              <w:t xml:space="preserve">1,21</w:t>
+              <w:t xml:space="preserve">1,26</w:t>
             </w:r>
           </w:p>
         </w:tc>
@@ -7394,7 +7364,7 @@
               <w:jc w:val="center"/>
             </w:pPr>
             <w:r>
-              <w:t xml:space="preserve">1,00</w:t>
+              <w:t xml:space="preserve">0,96</w:t>
             </w:r>
           </w:p>
         </w:tc>
@@ -7426,7 +7396,7 @@
               <w:jc w:val="center"/>
             </w:pPr>
             <w:r>
-              <w:t xml:space="preserve">9,28</w:t>
+              <w:t xml:space="preserve">24,5</w:t>
             </w:r>
           </w:p>
         </w:tc>
@@ -7441,7 +7411,7 @@
               <w:jc w:val="center"/>
             </w:pPr>
             <w:r>
-              <w:t xml:space="preserve">6,96</w:t>
+              <w:t xml:space="preserve">19,8</w:t>
             </w:r>
           </w:p>
         </w:tc>
@@ -7456,7 +7426,7 @@
               <w:jc w:val="center"/>
             </w:pPr>
             <w:r>
-              <w:t xml:space="preserve">1,33</w:t>
+              <w:t xml:space="preserve">1,24</w:t>
             </w:r>
           </w:p>
         </w:tc>
@@ -7471,7 +7441,7 @@
               <w:jc w:val="center"/>
             </w:pPr>
             <w:r>
-              <w:t xml:space="preserve">1,00</w:t>
+              <w:t xml:space="preserve">0,95</w:t>
             </w:r>
           </w:p>
         </w:tc>
@@ -7503,7 +7473,7 @@
               <w:jc w:val="center"/>
             </w:pPr>
             <w:r>
-              <w:t xml:space="preserve">34,8</w:t>
+              <w:t xml:space="preserve">86,2</w:t>
             </w:r>
           </w:p>
         </w:tc>
@@ -7518,7 +7488,7 @@
               <w:jc w:val="center"/>
             </w:pPr>
             <w:r>
-              <w:t xml:space="preserve">23,2</w:t>
+              <w:t xml:space="preserve">66,1</w:t>
             </w:r>
           </w:p>
         </w:tc>
@@ -7533,7 +7503,7 @@
               <w:jc w:val="center"/>
             </w:pPr>
             <w:r>
-              <w:t xml:space="preserve">1,50</w:t>
+              <w:t xml:space="preserve">1,30</w:t>
             </w:r>
           </w:p>
         </w:tc>
@@ -7548,7 +7518,7 @@
               <w:jc w:val="center"/>
             </w:pPr>
             <w:r>
-              <w:t xml:space="preserve">1,04</w:t>
+              <w:t xml:space="preserve">0,95</w:t>
             </w:r>
           </w:p>
         </w:tc>
@@ -7580,7 +7550,7 @@
               <w:jc w:val="center"/>
             </w:pPr>
             <w:r>
-              <w:t xml:space="preserve">100</w:t>
+              <w:t xml:space="preserve">205</w:t>
             </w:r>
           </w:p>
         </w:tc>
@@ -7595,7 +7565,7 @@
               <w:jc w:val="center"/>
             </w:pPr>
             <w:r>
-              <w:t xml:space="preserve">55,4</w:t>
+              <w:t xml:space="preserve">174</w:t>
             </w:r>
           </w:p>
         </w:tc>
@@ -7610,7 +7580,7 @@
               <w:jc w:val="center"/>
             </w:pPr>
             <w:r>
-              <w:t xml:space="preserve">1,81</w:t>
+              <w:t xml:space="preserve">1,17</w:t>
             </w:r>
           </w:p>
         </w:tc>
@@ -7625,7 +7595,7 @@
               <w:jc w:val="center"/>
             </w:pPr>
             <w:r>
-              <w:t xml:space="preserve">1,04</w:t>
+              <w:t xml:space="preserve">0,92</w:t>
             </w:r>
           </w:p>
         </w:tc>
@@ -7657,7 +7627,7 @@
               <w:jc w:val="center"/>
             </w:pPr>
             <w:r>
-              <w:t xml:space="preserve">364</w:t>
+              <w:t xml:space="preserve">680</w:t>
             </w:r>
           </w:p>
         </w:tc>
@@ -7672,7 +7642,7 @@
               <w:jc w:val="center"/>
             </w:pPr>
             <w:r>
-              <w:t xml:space="preserve">183</w:t>
+              <w:t xml:space="preserve">542</w:t>
             </w:r>
           </w:p>
         </w:tc>
@@ -7687,7 +7657,7 @@
               <w:jc w:val="center"/>
             </w:pPr>
             <w:r>
-              <w:t xml:space="preserve">1,99</w:t>
+              <w:t xml:space="preserve">1,25</w:t>
             </w:r>
           </w:p>
         </w:tc>
@@ -7702,7 +7672,7 @@
               <w:jc w:val="center"/>
             </w:pPr>
             <w:r>
-              <w:t xml:space="preserve">1,02</w:t>
+              <w:t xml:space="preserve">0,93</w:t>
             </w:r>
           </w:p>
         </w:tc>
@@ -7734,7 +7704,7 @@
               <w:jc w:val="center"/>
             </w:pPr>
             <w:r>
-              <w:t xml:space="preserve">867</w:t>
+              <w:t xml:space="preserve">1712</w:t>
             </w:r>
           </w:p>
         </w:tc>
@@ -7749,7 +7719,7 @@
               <w:jc w:val="center"/>
             </w:pPr>
             <w:r>
-              <w:t xml:space="preserve">445</w:t>
+              <w:t xml:space="preserve">1779</w:t>
             </w:r>
           </w:p>
         </w:tc>
@@ -7764,7 +7734,7 @@
               <w:jc w:val="center"/>
             </w:pPr>
             <w:r>
-              <w:t xml:space="preserve">1,95</w:t>
+              <w:t xml:space="preserve">0,96</w:t>
             </w:r>
           </w:p>
         </w:tc>
@@ -7779,7 +7749,7 @@
               <w:jc w:val="center"/>
             </w:pPr>
             <w:r>
-              <w:t xml:space="preserve">1,04</w:t>
+              <w:t xml:space="preserve">0,82</w:t>
             </w:r>
           </w:p>
         </w:tc>
@@ -7951,7 +7921,7 @@
         </w:rPr>
         <w:drawing>
           <wp:inline distT="0" distB="0" distL="0" distR="0">
-            <wp:extent cx="5760000" cy="4855272"/>
+            <wp:extent cx="5760000" cy="4864000"/>
             <wp:effectExtent l="0" t="0" r="0" b="0"/>
             <wp:docPr id="1005" name="Рисунок 5"/>
             <wp:cNvGraphicFramePr>
@@ -7973,7 +7943,7 @@
                   <pic:spPr>
                     <a:xfrm>
                       <a:off x="0" y="0"/>
-                      <a:ext cx="5760000" cy="4855272"/>
+                      <a:ext cx="5760000" cy="4864000"/>
                     </a:xfrm>
                     <a:prstGeom prst="rect">
                       <a:avLst/>
@@ -8058,7 +8028,7 @@
         </m:r>
       </m:oMath>
       <w:r>
-        <w:t xml:space="preserve"> из-за накопления ошибок округления в скалярных произведениях. Наибольшая погрешность среди всех сборок и режимов — 3,01·10⁻¹⁴, то есть не более 135 машинных эпсилон, тогда как ошибка в программе дала бы погрешность порядка единицы. Ускорение во всех случаях получено без потери точности.</w:t>
+        <w:t xml:space="preserve"> из-за накопления ошибок округления в скалярных произведениях. Наибольшая погрешность среди всех сборок и режимов — 3,08·10⁻¹⁴, то есть не более 139 машинных эпсилон, тогда как ошибка в программе дала бы погрешность порядка единицы. Ускорение во всех случаях получено без потери точности.</w:t>
       </w:r>
     </w:p>
     <w:p>
@@ -8074,7 +8044,7 @@
         <w:pStyle w:val="1-"/>
       </w:pPr>
       <w:r>
-        <w:t xml:space="preserve">Для блочного алгоритма ускорение от флага компиляции растёт с 4,33 при </w:t>
+        <w:t xml:space="preserve">Для блочного алгоритма ускорение от флага компиляции уменьшается с 4,26 при </w:t>
       </w:r>
       <m:oMath>
         <m:r>
@@ -8091,7 +8061,7 @@
         </m:r>
       </m:oMath>
       <w:r>
-        <w:t xml:space="preserve"> до 6,86 при </w:t>
+        <w:t xml:space="preserve"> до 3,24 при </w:t>
       </w:r>
       <m:oMath>
         <m:r>
@@ -8108,7 +8078,7 @@
         </m:r>
       </m:oMath>
       <w:r>
-        <w:t xml:space="preserve"> (наибольшее значение 7,08 при </w:t>
+        <w:t xml:space="preserve"> (наибольшее значение 4,26 при </w:t>
       </w:r>
       <m:oMath>
         <m:r>
@@ -8121,11 +8091,11 @@
           <m:t>=</m:t>
         </m:r>
         <m:r>
-          <m:t>1536</m:t>
+          <m:t>64</m:t>
         </m:r>
       </m:oMath>
       <w:r>
-        <w:t xml:space="preserve">). При малых </w:t>
+        <w:t xml:space="preserve">). Программа без флага ограничена числом выполняемых команд: её производительность (0,50–0,57 GFLOP/s) почти не зависит от </w:t>
       </w:r>
       <m:oMath>
         <m:r>
@@ -8133,7 +8103,15 @@
         </m:r>
       </m:oMath>
       <w:r>
-        <w:t xml:space="preserve"> в оптимизированной программе заметна доля коротких циклов и неполных блоков, а при больших </w:t>
+        <w:t xml:space="preserve">.</w:t>
+      </w:r>
+    </w:p>
+    <w:p>
+      <w:pPr>
+        <w:pStyle w:val="1-"/>
+      </w:pPr>
+      <w:r>
+        <w:t xml:space="preserve">Для точечного алгоритма ускорение, напротив, уменьшается с 4,33 до 2,77: при больших </w:t>
       </w:r>
       <m:oMath>
         <m:r>
@@ -8141,15 +8119,15 @@
         </m:r>
       </m:oMath>
       <w:r>
-        <w:t xml:space="preserve"> основное время занимает умножение блоков, данные которых находятся в кэш-памяти, поэтому ускорение выходит на плато. Программа без флага ограничена числом выполняемых команд: её производительность (0,90–0,98 GFLOP/s) почти не зависит от </w:t>
-      </w:r>
-      <m:oMath>
-        <m:r>
-          <m:t>N</m:t>
-        </m:r>
-      </m:oMath>
-      <w:r>
-        <w:t xml:space="preserve">.</w:t>
+        <w:t xml:space="preserve"> строки матрицы перестают помещаться в кэш-память, и оптимизированная программа значительную часть времени ожидает данные из оперативной памяти — ключи компиляции не ускоряют обращения к памяти.</w:t>
+      </w:r>
+    </w:p>
+    <w:p>
+      <w:pPr>
+        <w:pStyle w:val="3"/>
+      </w:pPr>
+      <w:r>
+        <w:t xml:space="preserve">Ускорение блочного алгоритма</w:t>
       </w:r>
     </w:p>
     <w:p>
@@ -8157,31 +8135,7 @@
         <w:pStyle w:val="1-"/>
       </w:pPr>
       <w:r>
-        <w:t xml:space="preserve">Для точечного алгоритма ускорение, напротив, уменьшается с 7,07 до 3,66: при больших </w:t>
-      </w:r>
-      <m:oMath>
-        <m:r>
-          <m:t>N</m:t>
-        </m:r>
-      </m:oMath>
-      <w:r>
-        <w:t xml:space="preserve"> строки матрицы перестают помещаться в кэш-память, и оптимизированная программа значительную часть времени ожидает данные из оперативной памяти — ключи компиляции не ускоряют обращения к памяти.</w:t>
-      </w:r>
-    </w:p>
-    <w:p>
-      <w:pPr>
-        <w:pStyle w:val="3"/>
-      </w:pPr>
-      <w:r>
-        <w:t xml:space="preserve">Ускорение блочного алгоритма</w:t>
-      </w:r>
-    </w:p>
-    <w:p>
-      <w:pPr>
-        <w:pStyle w:val="1-"/>
-      </w:pPr>
-      <w:r>
-        <w:t xml:space="preserve">В сборке с флагом ускорение блочного алгоритма относительно точечного растёт с 0,55 при </w:t>
+        <w:t xml:space="preserve">В сборке с флагом ускорение блочного алгоритма относительно точечного почти не меняется с 0,91 при </w:t>
       </w:r>
       <m:oMath>
         <m:r>
@@ -8198,7 +8152,7 @@
         </m:r>
       </m:oMath>
       <w:r>
-        <w:t xml:space="preserve"> до 1,95 при </w:t>
+        <w:t xml:space="preserve"> до 0,96 при </w:t>
       </w:r>
       <m:oMath>
         <m:r>
@@ -8228,7 +8182,7 @@
           <m:t>&lt;</m:t>
         </m:r>
         <m:r>
-          <m:t>256</m:t>
+          <m:t>128</m:t>
         </m:r>
       </m:oMath>
       <w:r>
@@ -8270,7 +8224,7 @@
           <m:t>=</m:t>
         </m:r>
         <m:r>
-          <m:t>256</m:t>
+          <m:t>128</m:t>
         </m:r>
       </m:oMath>
       <w:r>
@@ -8294,7 +8248,7 @@
         </m:sSup>
       </m:oMath>
       <w:r>
-        <w:t xml:space="preserve"> байт) не помещается в кэш L2 (2 МБ на ядро) начиная с </w:t>
+        <w:t xml:space="preserve"> байт) не помещается в кэш L2 (256 КБ на ядро) начиная с </w:t>
       </w:r>
       <m:oMath>
         <m:r>
@@ -8307,7 +8261,7 @@
           <m:t>≈</m:t>
         </m:r>
         <m:r>
-          <m:t>724</m:t>
+          <m:t>256</m:t>
         </m:r>
       </m:oMath>
       <w:r>
@@ -8367,7 +8321,7 @@
           <m:t>,</m:t>
         </m:r>
         <m:r>
-          <m:t>89</m:t>
+          <m:t>82</m:t>
         </m:r>
         <m:r>
           <m:rPr>
@@ -8376,7 +8330,7 @@
           <m:t>…</m:t>
         </m:r>
         <m:r>
-          <m:t>1</m:t>
+          <m:t>0</m:t>
         </m:r>
         <m:r>
           <m:rPr>
@@ -8385,7 +8339,7 @@
           <m:t>,</m:t>
         </m:r>
         <m:r>
-          <m:t>04</m:t>
+          <m:t>96</m:t>
         </m:r>
       </m:oMath>
       <w:r>
@@ -8422,7 +8376,7 @@
         </m:r>
       </m:oMath>
       <w:r>
-        <w:t xml:space="preserve"> медленнее в 1,35 раза, точечный — в 1,69 раза. Разрешение переставлять сложения (</w:t>
+        <w:t xml:space="preserve"> медленнее в 0,95 раза, точечный — в 0,99 раза. Разрешение переставлять сложения (</w:t>
       </w:r>
       <w:r>
         <w:rPr>
@@ -8433,7 +8387,7 @@
         <w:t xml:space="preserve">-ffast-math</w:t>
       </w:r>
       <w:r>
-        <w:t xml:space="preserve">) ускоряет их ещё в 1,60 и 1,93 раза: только с ним скалярное произведение векторизуется полностью (частичные суммы в векторном регистре), при этом результат меняется в последних разрядах. Наименьшее время разложения получено при </w:t>
+        <w:t xml:space="preserve">) ускоряет их ещё в 1,70 и 2,99 раза: только с ним скалярное произведение векторизуется полностью (частичные суммы в векторном регистре), при этом результат меняется в последних разрядах. Наименьшее время разложения получено при </w:t>
       </w:r>
       <m:oMath>
         <m:r>
@@ -8446,7 +8400,7 @@
           <m:t>=</m:t>
         </m:r>
         <m:r>
-          <m:t>48</m:t>
+          <m:t>24</m:t>
         </m:r>
       </m:oMath>
       <w:r>
@@ -8480,7 +8434,7 @@
           <m:t>=</m:t>
         </m:r>
         <m:r>
-          <m:t>24</m:t>
+          <m:t>8</m:t>
         </m:r>
       </m:oMath>
       <w:r>
@@ -8518,7 +8472,7 @@
         </m:r>
       </m:oMath>
       <w:r>
-        <w:t xml:space="preserve"> время больше наименьшего не более чем на 2,0 %. Три блока </w:t>
+        <w:t xml:space="preserve"> время больше наименьшего не более чем на 16,5 %. Три блока </w:t>
       </w:r>
       <m:oMath>
         <m:r>
@@ -8535,7 +8489,7 @@
         </m:r>
       </m:oMath>
       <w:r>
-        <w:t xml:space="preserve">, участвующие в модификации, занимают 24 КБ и помещаются в кэш L1 (48 КБ на ядро).</w:t>
+        <w:t xml:space="preserve">, участвующие в модификации, занимают 24 КБ.</w:t>
       </w:r>
     </w:p>
     <w:p>
@@ -8615,7 +8569,7 @@
         </w:numPr>
       </w:pPr>
       <w:r>
-        <w:t xml:space="preserve">Флаг компиляции ускоряет блочный алгоритм в 6,86 раза при </w:t>
+        <w:t xml:space="preserve">Флаг компиляции ускоряет блочный алгоритм в 3,24 раза при </w:t>
       </w:r>
       <m:oMath>
         <m:r>
@@ -8640,7 +8594,7 @@
         </m:r>
       </m:oMath>
       <w:r>
-        <w:t xml:space="preserve"> составляет 3,66.</w:t>
+        <w:t xml:space="preserve"> составляет 2,77.</w:t>
       </w:r>
     </w:p>
     <w:p>
@@ -8652,7 +8606,7 @@
         </w:numPr>
       </w:pPr>
       <w:r>
-        <w:t xml:space="preserve">Блочный алгоритм в сборке с флагом быстрее точечного в 1,95 раза при </w:t>
+        <w:t xml:space="preserve">Блочный алгоритм в сборке с флагом быстрее точечного в 0,96 раза при </w:t>
       </w:r>
       <m:oMath>
         <m:r>
@@ -8681,7 +8635,7 @@
         </w:numPr>
       </w:pPr>
       <w:r>
-        <w:t xml:space="preserve">Наибольшая производительность блочного алгоритма — 6,6 GFLOP/s в сборке с флагом и 11,2 GFLOP/s с </w:t>
+        <w:t xml:space="preserve">Наибольшая производительность блочного алгоритма — 2,4 GFLOP/s в сборке с флагом и 4,3 GFLOP/s с </w:t>
       </w:r>
       <w:r>
         <w:rPr>

</xml_diff>